<commit_message>
Enhance RetailSphere BPA document with detailed data sources and architectural implications for Priya's section.
</commit_message>
<xml_diff>
--- a/docs/02-business-process-analysis/RetailSphere_BPA001_Draft_v0.3.docx
+++ b/docs/02-business-process-analysis/RetailSphere_BPA001_Draft_v0.3.docx
@@ -490,21 +490,7 @@
         <w:rPr>
           <w:color w:val="1A1A1A"/>
         </w:rPr>
-        <w:t xml:space="preserve">This document captures findings from Step 2 of the </w:t>
-      </w:r>
-      <w:proofErr w:type="spellStart"/>
-      <w:r>
-        <w:rPr>
-          <w:color w:val="1A1A1A"/>
-        </w:rPr>
-        <w:t>RetailSphere</w:t>
-      </w:r>
-      <w:proofErr w:type="spellEnd"/>
-      <w:r>
-        <w:rPr>
-          <w:color w:val="1A1A1A"/>
-        </w:rPr>
-        <w:t xml:space="preserve"> Data Platform Design Process — Business Process Analysis. The purpose of Step 2 is to understand what each business domain actually does, what decisions stakeholders make daily, what questions they cannot currently answer, and what good looks like in 12 months. These findings drive the functional requirements in Step 3.</w:t>
+        <w:t>This document captures findings from Step 2 of the RetailSphere Data Platform Design Process — Business Process Analysis. The purpose of Step 2 is to understand what each business domain actually does, what decisions stakeholders make daily, what questions they cannot currently answer, and what good looks like in 12 months. These findings drive the functional requirements in Step 3.</w:t>
       </w:r>
     </w:p>
     <w:p>
@@ -898,18 +884,8 @@
                 <w:sz w:val="19"/>
                 <w:szCs w:val="19"/>
               </w:rPr>
-              <w:t xml:space="preserve">Inventory </w:t>
-            </w:r>
-            <w:proofErr w:type="spellStart"/>
-            <w:r>
-              <w:rPr>
-                <w:color w:val="1A1A1A"/>
-                <w:sz w:val="19"/>
-                <w:szCs w:val="19"/>
-              </w:rPr>
-              <w:t>Mgmt</w:t>
-            </w:r>
-            <w:proofErr w:type="spellEnd"/>
+              <w:t>Inventory Mgmt</w:t>
+            </w:r>
           </w:p>
         </w:tc>
         <w:tc>
@@ -1493,7 +1469,6 @@
         </w:pBdr>
         <w:spacing w:before="200" w:after="120"/>
       </w:pPr>
-      <w:proofErr w:type="gramStart"/>
       <w:r>
         <w:rPr>
           <w:b/>
@@ -1502,18 +1477,7 @@
           <w:sz w:val="26"/>
           <w:szCs w:val="26"/>
         </w:rPr>
-        <w:t>3.1  Procurement</w:t>
-      </w:r>
-      <w:proofErr w:type="gramEnd"/>
-      <w:r>
-        <w:rPr>
-          <w:b/>
-          <w:bCs/>
-          <w:color w:val="1A2E5A"/>
-          <w:sz w:val="26"/>
-          <w:szCs w:val="26"/>
-        </w:rPr>
-        <w:t xml:space="preserve"> — Sipho Dlamini, Head of Procurement</w:t>
+        <w:t>3.1  Procurement — Sipho Dlamini, Head of Procurement</w:t>
       </w:r>
     </w:p>
     <w:p>
@@ -1555,35 +1519,7 @@
         <w:rPr>
           <w:color w:val="1A1A1A"/>
         </w:rPr>
-        <w:t xml:space="preserve">The procurement process at </w:t>
-      </w:r>
-      <w:proofErr w:type="spellStart"/>
-      <w:r>
-        <w:rPr>
-          <w:color w:val="1A1A1A"/>
-        </w:rPr>
-        <w:t>RetailSphere</w:t>
-      </w:r>
-      <w:proofErr w:type="spellEnd"/>
-      <w:r>
-        <w:rPr>
-          <w:color w:val="1A1A1A"/>
-        </w:rPr>
-        <w:t xml:space="preserve"> follows five stages: (1) Demand signal — store POS flags low stock or planning team runs SAP replenishment report, triggering a Purchase Requisition. (2) Purchase Order creation — buyer selects supplier and raises PO. This decision is undocumented and lives in the buyer's head. (3) Supplier confirmation — supplier confirms via email; team manually updates SAP. (4) Goods Receipt — warehouse team captures GRN in SAP against PO. Currently batch-captured at end of day, creating timestamp unreliability. (5) Invoice matching — three-way match in SAP (PO + GRN + invoice). Exceptions managed in Excel. (6) Payment — SAP payment run on 30/60/</w:t>
-      </w:r>
-      <w:proofErr w:type="gramStart"/>
-      <w:r>
-        <w:rPr>
-          <w:color w:val="1A1A1A"/>
-        </w:rPr>
-        <w:t>90 day</w:t>
-      </w:r>
-      <w:proofErr w:type="gramEnd"/>
-      <w:r>
-        <w:rPr>
-          <w:color w:val="1A1A1A"/>
-        </w:rPr>
-        <w:t xml:space="preserve"> supplier terms.</w:t>
+        <w:t>The procurement process at RetailSphere follows five stages: (1) Demand signal — store POS flags low stock or planning team runs SAP replenishment report, triggering a Purchase Requisition. (2) Purchase Order creation — buyer selects supplier and raises PO. This decision is undocumented and lives in the buyer's head. (3) Supplier confirmation — supplier confirms via email; team manually updates SAP. (4) Goods Receipt — warehouse team captures GRN in SAP against PO. Currently batch-captured at end of day, creating timestamp unreliability. (5) Invoice matching — three-way match in SAP (PO + GRN + invoice). Exceptions managed in Excel. (6) Payment — SAP payment run on 30/60/90 day supplier terms.</w:t>
       </w:r>
     </w:p>
     <w:p>
@@ -1636,21 +1572,7 @@
         <w:rPr>
           <w:color w:val="1A1A1A"/>
         </w:rPr>
-        <w:t xml:space="preserve">Monthly: Board reporting — procurement savings as % of total </w:t>
-      </w:r>
-      <w:proofErr w:type="gramStart"/>
-      <w:r>
-        <w:rPr>
-          <w:color w:val="1A1A1A"/>
-        </w:rPr>
-        <w:t>spend</w:t>
-      </w:r>
-      <w:proofErr w:type="gramEnd"/>
-      <w:r>
-        <w:rPr>
-          <w:color w:val="1A1A1A"/>
-        </w:rPr>
-        <w:t>. Currently calculated manually over 3 days in Excel.</w:t>
+        <w:t>Monthly: Board reporting — procurement savings as % of total spend. Currently calculated manually over 3 days in Excel.</w:t>
       </w:r>
     </w:p>
     <w:p>
@@ -1900,79 +1822,7 @@
                 <w:sz w:val="19"/>
                 <w:szCs w:val="19"/>
               </w:rPr>
-              <w:t xml:space="preserve">Goods are batch-captured at end of day. SAP posting timestamp ≠ actual delivery time. Bronze layer workaround: four timestamp columns per GRN record — </w:t>
-            </w:r>
-            <w:proofErr w:type="spellStart"/>
-            <w:r>
-              <w:rPr>
-                <w:color w:val="1A1A1A"/>
-                <w:sz w:val="19"/>
-                <w:szCs w:val="19"/>
-              </w:rPr>
-              <w:t>sap_posting_timestamp</w:t>
-            </w:r>
-            <w:proofErr w:type="spellEnd"/>
-            <w:r>
-              <w:rPr>
-                <w:color w:val="1A1A1A"/>
-                <w:sz w:val="19"/>
-                <w:szCs w:val="19"/>
-              </w:rPr>
-              <w:t xml:space="preserve">, </w:t>
-            </w:r>
-            <w:proofErr w:type="spellStart"/>
-            <w:r>
-              <w:rPr>
-                <w:color w:val="1A1A1A"/>
-                <w:sz w:val="19"/>
-                <w:szCs w:val="19"/>
-              </w:rPr>
-              <w:t>claimed_delivery_date</w:t>
-            </w:r>
-            <w:proofErr w:type="spellEnd"/>
-            <w:r>
-              <w:rPr>
-                <w:color w:val="1A1A1A"/>
-                <w:sz w:val="19"/>
-                <w:szCs w:val="19"/>
-              </w:rPr>
-              <w:t xml:space="preserve">, </w:t>
-            </w:r>
-            <w:proofErr w:type="spellStart"/>
-            <w:r>
-              <w:rPr>
-                <w:color w:val="1A1A1A"/>
-                <w:sz w:val="19"/>
-                <w:szCs w:val="19"/>
-              </w:rPr>
-              <w:t>grn_capture_timestamp</w:t>
-            </w:r>
-            <w:proofErr w:type="spellEnd"/>
-            <w:r>
-              <w:rPr>
-                <w:color w:val="1A1A1A"/>
-                <w:sz w:val="19"/>
-                <w:szCs w:val="19"/>
-              </w:rPr>
-              <w:t xml:space="preserve">, </w:t>
-            </w:r>
-            <w:proofErr w:type="spellStart"/>
-            <w:r>
-              <w:rPr>
-                <w:color w:val="1A1A1A"/>
-                <w:sz w:val="19"/>
-                <w:szCs w:val="19"/>
-              </w:rPr>
-              <w:t>data_ingested_timestamp</w:t>
-            </w:r>
-            <w:proofErr w:type="spellEnd"/>
-            <w:r>
-              <w:rPr>
-                <w:color w:val="1A1A1A"/>
-                <w:sz w:val="19"/>
-                <w:szCs w:val="19"/>
-              </w:rPr>
-              <w:t>.</w:t>
+              <w:t>Goods are batch-captured at end of day. SAP posting timestamp ≠ actual delivery time. Bronze layer workaround: four timestamp columns per GRN record — sap_posting_timestamp, claimed_delivery_date, grn_capture_timestamp, data_ingested_timestamp.</w:t>
             </w:r>
           </w:p>
         </w:tc>
@@ -2202,7 +2052,6 @@
         </w:pBdr>
         <w:spacing w:before="200" w:after="120"/>
       </w:pPr>
-      <w:proofErr w:type="gramStart"/>
       <w:r>
         <w:rPr>
           <w:b/>
@@ -2211,18 +2060,7 @@
           <w:sz w:val="26"/>
           <w:szCs w:val="26"/>
         </w:rPr>
-        <w:t>3.2  Inventory</w:t>
-      </w:r>
-      <w:proofErr w:type="gramEnd"/>
-      <w:r>
-        <w:rPr>
-          <w:b/>
-          <w:bCs/>
-          <w:color w:val="1A2E5A"/>
-          <w:sz w:val="26"/>
-          <w:szCs w:val="26"/>
-        </w:rPr>
-        <w:t xml:space="preserve"> Management — Zanele Mokoena, National Inventory Manager</w:t>
+        <w:t>3.2  Inventory Management — Zanele Mokoena, National Inventory Manager</w:t>
       </w:r>
     </w:p>
     <w:p>
@@ -3460,29 +3298,7 @@
                 <w:sz w:val="19"/>
                 <w:szCs w:val="19"/>
               </w:rPr>
-              <w:t xml:space="preserve">This finding must be formally acknowledged by the business before the platform goes live. Failure to do so creates a risk that leadership treats </w:t>
-            </w:r>
-            <w:proofErr w:type="gramStart"/>
-            <w:r>
-              <w:rPr>
-                <w:b/>
-                <w:bCs/>
-                <w:color w:val="8B1A1A"/>
-                <w:sz w:val="19"/>
-                <w:szCs w:val="19"/>
-              </w:rPr>
-              <w:t>Gold</w:t>
-            </w:r>
-            <w:proofErr w:type="gramEnd"/>
-            <w:r>
-              <w:rPr>
-                <w:b/>
-                <w:bCs/>
-                <w:color w:val="8B1A1A"/>
-                <w:sz w:val="19"/>
-                <w:szCs w:val="19"/>
-              </w:rPr>
-              <w:t xml:space="preserve"> layer inventory numbers as precise when they are estimates. Contrast with Procurement: Procurement problems are process-driven and fixable. Inventory problems are structural and require operational change beyond the data platform scope.</w:t>
+              <w:t>This finding must be formally acknowledged by the business before the platform goes live. Failure to do so creates a risk that leadership treats Gold layer inventory numbers as precise when they are estimates. Contrast with Procurement: Procurement problems are process-driven and fixable. Inventory problems are structural and require operational change beyond the data platform scope.</w:t>
             </w:r>
           </w:p>
         </w:tc>
@@ -3588,7 +3404,6 @@
         </w:pBdr>
         <w:spacing w:before="200" w:after="120"/>
       </w:pPr>
-      <w:proofErr w:type="gramStart"/>
       <w:r>
         <w:rPr>
           <w:b/>
@@ -3598,18 +3413,7 @@
           <w:szCs w:val="26"/>
         </w:rPr>
         <w:lastRenderedPageBreak/>
-        <w:t>3.3  Sales</w:t>
-      </w:r>
-      <w:proofErr w:type="gramEnd"/>
-      <w:r>
-        <w:rPr>
-          <w:b/>
-          <w:bCs/>
-          <w:color w:val="1A2E5A"/>
-          <w:sz w:val="26"/>
-          <w:szCs w:val="26"/>
-        </w:rPr>
-        <w:t xml:space="preserve"> &amp; Marketing — Rethabile Sithole, Chief Commercial Officer</w:t>
+        <w:t>3.3  Sales &amp; Marketing — Rethabile Sithole, Chief Commercial Officer</w:t>
       </w:r>
     </w:p>
     <w:p>
@@ -3779,25 +3583,7 @@
                 <w:sz w:val="19"/>
                 <w:szCs w:val="19"/>
               </w:rPr>
-              <w:t xml:space="preserve">Loyalty team defines lapsed as 12 months no purchase. E-commerce team defines it as 90 days. Store ops </w:t>
-            </w:r>
-            <w:proofErr w:type="gramStart"/>
-            <w:r>
-              <w:rPr>
-                <w:color w:val="1A1A1A"/>
-                <w:sz w:val="19"/>
-                <w:szCs w:val="19"/>
-              </w:rPr>
-              <w:t>has</w:t>
-            </w:r>
-            <w:proofErr w:type="gramEnd"/>
-            <w:r>
-              <w:rPr>
-                <w:color w:val="1A1A1A"/>
-                <w:sz w:val="19"/>
-                <w:szCs w:val="19"/>
-              </w:rPr>
-              <w:t xml:space="preserve"> no definition. Board-level retention rate is an educated guess. Business definition agreed in interview: 6 months no engagement signal (purchase, browse, email open, store visit).</w:t>
+              <w:t>Loyalty team defines lapsed as 12 months no purchase. E-commerce team defines it as 90 days. Store ops has no definition. Board-level retention rate is an educated guess. Business definition agreed in interview: 6 months no engagement signal (purchase, browse, email open, store visit).</w:t>
             </w:r>
           </w:p>
         </w:tc>
@@ -4035,21 +3821,7 @@
         <w:rPr>
           <w:color w:val="1A1A1A"/>
         </w:rPr>
-        <w:t xml:space="preserve">Meta Business Manager — paid social </w:t>
-      </w:r>
-      <w:proofErr w:type="gramStart"/>
-      <w:r>
-        <w:rPr>
-          <w:color w:val="1A1A1A"/>
-        </w:rPr>
-        <w:t>spend</w:t>
-      </w:r>
-      <w:proofErr w:type="gramEnd"/>
-      <w:r>
-        <w:rPr>
-          <w:color w:val="1A1A1A"/>
-        </w:rPr>
-        <w:t xml:space="preserve"> and platform attribution data.</w:t>
+        <w:t>Meta Business Manager — paid social spend and platform attribution data.</w:t>
       </w:r>
     </w:p>
     <w:p>
@@ -4120,21 +3892,7 @@
         <w:rPr>
           <w:color w:val="1A1A1A"/>
         </w:rPr>
-        <w:t xml:space="preserve">ADR-006 raised: Marketing Attribution Logic — attribution window, model type, and cross-channel weighting must be agreed before </w:t>
-      </w:r>
-      <w:proofErr w:type="gramStart"/>
-      <w:r>
-        <w:rPr>
-          <w:color w:val="1A1A1A"/>
-        </w:rPr>
-        <w:t>Gold</w:t>
-      </w:r>
-      <w:proofErr w:type="gramEnd"/>
-      <w:r>
-        <w:rPr>
-          <w:color w:val="1A1A1A"/>
-        </w:rPr>
-        <w:t xml:space="preserve"> layer marketing build.</w:t>
+        <w:t>ADR-006 raised: Marketing Attribution Logic — attribution window, model type, and cross-channel weighting must be agreed before Gold layer marketing build.</w:t>
       </w:r>
     </w:p>
     <w:p>
@@ -4371,13 +4129,7 @@
         <w:spacing w:before="200" w:after="80"/>
       </w:pPr>
       <w:r>
-        <w:t xml:space="preserve">In 12 </w:t>
-      </w:r>
-      <w:r>
-        <w:t>months,</w:t>
-      </w:r>
-      <w:r>
-        <w:t xml:space="preserve"> Priya's team will be able to see every communication sent to every member in one place. When a member says stop, it stops everywhere, immediately with no exceptions. Priya's team will be able to intervene before members leave not after. No member will receive more than four contacts a month as Priya will know on the same day if that rule is breached and she can action immediately.</w:t>
+        <w:t>In 12 months, Priya's team will be able to see every communication sent to every member in one place. When a member says stop, it stops everywhere, immediately with no exceptions. Priya's team will be able to intervene before members leave not after. No member will receive more than four contacts a month as Priya will know on the same day if that rule is breached and she can action immediately.</w:t>
       </w:r>
     </w:p>
     <w:p>
@@ -4402,20 +4154,23 @@
     </w:p>
     <w:p>
       <w:pPr>
-        <w:spacing w:before="80" w:after="80"/>
-      </w:pPr>
-      <w:r>
-        <w:rPr>
-          <w:i/>
-          <w:iCs/>
-          <w:color w:val="555555"/>
-        </w:rPr>
-        <w:t>To be completed following interview.</w:t>
-      </w:r>
-    </w:p>
-    <w:p>
-      <w:pPr>
-        <w:spacing w:before="80"/>
+        <w:spacing w:before="200" w:after="80"/>
+      </w:pPr>
+      <w:r>
+        <w:t>Priya's primary source system is Salesforce CRM which holds the full loyalty member database of 2.1 million registered members including identity attributes, rewards history, and communication preferences. The Customer dimension is further enriched by three systems from the Marketing domain — Salesforce Marketing Cloud, Meta Business Manager, and Google Analytics 4 — which generate campaign engagement data that flows back into the customer profile.</w:t>
+      </w:r>
+    </w:p>
+    <w:p>
+      <w:pPr>
+        <w:spacing w:before="200" w:after="80"/>
+      </w:pPr>
+      <w:r>
+        <w:t>Two data quality issues were identified during the interview. The first is the absence of a unified customer identifier — loyalty member records in Salesforce CRM cannot be reliably linked to Shopify transactions or Oracle MICROS POS receipts without identity resolution logic, meaning customer behaviour across channels is invisible. The second and most urgent quality issue is the absence of cross-system opt-out communication. When a member opts out in one system, there is no mechanism to communicate that event to the other two systems. This means members who have legally withdrawn their marketing consent continue to receive communications through channels that have not received the opt-out signal — a direct POPIA compliance risk.</w:t>
+      </w:r>
+    </w:p>
+    <w:p>
+      <w:pPr>
+        <w:spacing w:before="200" w:after="80"/>
       </w:pPr>
     </w:p>
     <w:p>
@@ -4435,16 +4190,48 @@
     </w:p>
     <w:p>
       <w:pPr>
-        <w:spacing w:before="80" w:after="80"/>
-      </w:pPr>
-      <w:r>
-        <w:rPr>
-          <w:i/>
-          <w:iCs/>
-          <w:color w:val="555555"/>
-        </w:rPr>
-        <w:t>To be completed following interview.</w:t>
-      </w:r>
+        <w:spacing w:before="200" w:after="80"/>
+      </w:pPr>
+      <w:r>
+        <w:t>Priya's interview introduced four architectural requirements that were not present before the interview.</w:t>
+      </w:r>
+    </w:p>
+    <w:p>
+      <w:pPr>
+        <w:spacing w:before="200" w:after="80"/>
+      </w:pPr>
+      <w:r>
+        <w:t>First, a Contact History fact table is required — one row per communication event per member per channel, sourced from all three marketing systems. This table enables rolling 30-day contact frequency calculation per member and breach detection when a member exceeds four communications in a month.</w:t>
+      </w:r>
+    </w:p>
+    <w:p>
+      <w:pPr>
+        <w:spacing w:before="200" w:after="80"/>
+      </w:pPr>
+      <w:r>
+        <w:t>Second, the POPIA opt-out compliance requirement forces a tiered ingestion pipeline design. Opt-out events cannot wait for nightly batch processing. A near real-time pipeline must propagate opt-out events across Salesforce CRM, Salesforce Marketing Cloud, Meta Business Manager, and Google Analytics 4 within four hours of the opt-out event occurring.</w:t>
+      </w:r>
+    </w:p>
+    <w:p>
+      <w:pPr>
+        <w:spacing w:before="200" w:after="80"/>
+      </w:pPr>
+      <w:r>
+        <w:t>Third, two new dimension considerations are introduced by Priya's contact governance rules — a Customer Preference dimension capturing opt-out status, channel preferences, and communication frequency limits, and a Campaign Frequency dimension tracking contact counts per member per rolling window. Both are referenced from the Customer dimension and governed by Priya as Data Steward.</w:t>
+      </w:r>
+    </w:p>
+    <w:p>
+      <w:pPr>
+        <w:spacing w:before="200" w:after="80"/>
+      </w:pPr>
+      <w:r>
+        <w:t>Fourth, ADR-007 — Contact Governance and Opt-out Propagation Architecture — was raised as a result of this interview. This ADR must be formally agreed and signed before any contact governance logic is built into the platform, as it covers tiered ingestion design, suppression logic, breach alerting, and cross-system opt-out propagation rules.</w:t>
+      </w:r>
+    </w:p>
+    <w:p>
+      <w:pPr>
+        <w:spacing w:before="200" w:after="80"/>
+      </w:pPr>
     </w:p>
     <w:p>
       <w:pPr>
@@ -4532,7 +4319,6 @@
         </w:pBdr>
         <w:spacing w:before="200" w:after="120"/>
       </w:pPr>
-      <w:proofErr w:type="gramStart"/>
       <w:r>
         <w:rPr>
           <w:b/>
@@ -4541,18 +4327,7 @@
           <w:sz w:val="26"/>
           <w:szCs w:val="26"/>
         </w:rPr>
-        <w:t>3.5  Finance</w:t>
-      </w:r>
-      <w:proofErr w:type="gramEnd"/>
-      <w:r>
-        <w:rPr>
-          <w:b/>
-          <w:bCs/>
-          <w:color w:val="1A2E5A"/>
-          <w:sz w:val="26"/>
-          <w:szCs w:val="26"/>
-        </w:rPr>
-        <w:t xml:space="preserve"> — Johan van der Merwe, Group Financial Controller</w:t>
+        <w:t>3.5  Finance — Johan van der Merwe, Group Financial Controller</w:t>
       </w:r>
     </w:p>
     <w:p>
@@ -4826,7 +4601,6 @@
           <w:sz w:val="22"/>
           <w:szCs w:val="22"/>
         </w:rPr>
-        <w:lastRenderedPageBreak/>
         <w:t>Data Sources and Quality Issues Identified</w:t>
       </w:r>
     </w:p>
@@ -4903,7 +4677,6 @@
       <w:pPr>
         <w:spacing w:before="300" w:after="120"/>
       </w:pPr>
-      <w:proofErr w:type="gramStart"/>
       <w:r>
         <w:rPr>
           <w:b/>
@@ -4912,18 +4685,7 @@
           <w:sz w:val="26"/>
           <w:szCs w:val="26"/>
         </w:rPr>
-        <w:t>4.1  Structural</w:t>
-      </w:r>
-      <w:proofErr w:type="gramEnd"/>
-      <w:r>
-        <w:rPr>
-          <w:b/>
-          <w:bCs/>
-          <w:color w:val="1A2E5A"/>
-          <w:sz w:val="26"/>
-          <w:szCs w:val="26"/>
-        </w:rPr>
-        <w:t xml:space="preserve"> vs Process Problems — Critical Distinction</w:t>
+        <w:t>4.1  Structural vs Process Problems — Critical Distinction</w:t>
       </w:r>
     </w:p>
     <w:p>
@@ -5172,9 +4934,87 @@
                 <w:sz w:val="19"/>
                 <w:szCs w:val="19"/>
               </w:rPr>
-              <w:t xml:space="preserve">Inventory </w:t>
-            </w:r>
-            <w:proofErr w:type="spellStart"/>
+              <w:lastRenderedPageBreak/>
+              <w:t>Inventory Mgmt</w:t>
+            </w:r>
+          </w:p>
+        </w:tc>
+        <w:tc>
+          <w:tcPr>
+            <w:tcW w:w="3880" w:type="dxa"/>
+            <w:tcBorders>
+              <w:top w:val="single" w:sz="1" w:space="0" w:color="D0D8EC"/>
+              <w:left w:val="single" w:sz="1" w:space="0" w:color="D0D8EC"/>
+              <w:bottom w:val="single" w:sz="1" w:space="0" w:color="D0D8EC"/>
+              <w:right w:val="single" w:sz="1" w:space="0" w:color="D0D8EC"/>
+            </w:tcBorders>
+            <w:shd w:val="clear" w:color="auto" w:fill="F0FDF4"/>
+            <w:tcMar>
+              <w:top w:w="90" w:type="dxa"/>
+              <w:left w:w="140" w:type="dxa"/>
+              <w:bottom w:w="90" w:type="dxa"/>
+              <w:right w:w="140" w:type="dxa"/>
+            </w:tcMar>
+          </w:tcPr>
+          <w:p>
+            <w:r>
+              <w:rPr>
+                <w:color w:val="166534"/>
+                <w:sz w:val="19"/>
+                <w:szCs w:val="19"/>
+              </w:rPr>
+              <w:t>Inter-store transfer lag — process improvement can reduce.</w:t>
+            </w:r>
+          </w:p>
+        </w:tc>
+        <w:tc>
+          <w:tcPr>
+            <w:tcW w:w="3880" w:type="dxa"/>
+            <w:tcBorders>
+              <w:top w:val="single" w:sz="1" w:space="0" w:color="D0D8EC"/>
+              <w:left w:val="single" w:sz="1" w:space="0" w:color="D0D8EC"/>
+              <w:bottom w:val="single" w:sz="1" w:space="0" w:color="D0D8EC"/>
+              <w:right w:val="single" w:sz="1" w:space="0" w:color="D0D8EC"/>
+            </w:tcBorders>
+            <w:shd w:val="clear" w:color="auto" w:fill="FDF0F0"/>
+            <w:tcMar>
+              <w:top w:w="90" w:type="dxa"/>
+              <w:left w:w="140" w:type="dxa"/>
+              <w:bottom w:w="90" w:type="dxa"/>
+              <w:right w:w="140" w:type="dxa"/>
+            </w:tcMar>
+          </w:tcPr>
+          <w:p>
+            <w:r>
+              <w:rPr>
+                <w:color w:val="8B1A1A"/>
+                <w:sz w:val="19"/>
+                <w:szCs w:val="19"/>
+              </w:rPr>
+              <w:t>Replenishment trigger unreliable. Shrinkage in Excel. Returns split across two systems. All structural — BPA-Finding-001.</w:t>
+            </w:r>
+          </w:p>
+        </w:tc>
+      </w:tr>
+      <w:tr>
+        <w:tc>
+          <w:tcPr>
+            <w:tcW w:w="1600" w:type="dxa"/>
+            <w:tcBorders>
+              <w:top w:val="single" w:sz="1" w:space="0" w:color="D0D8EC"/>
+              <w:left w:val="single" w:sz="1" w:space="0" w:color="D0D8EC"/>
+              <w:bottom w:val="single" w:sz="1" w:space="0" w:color="D0D8EC"/>
+              <w:right w:val="single" w:sz="1" w:space="0" w:color="D0D8EC"/>
+            </w:tcBorders>
+            <w:shd w:val="clear" w:color="auto" w:fill="FFFFFF"/>
+            <w:tcMar>
+              <w:top w:w="90" w:type="dxa"/>
+              <w:left w:w="140" w:type="dxa"/>
+              <w:bottom w:w="90" w:type="dxa"/>
+              <w:right w:w="140" w:type="dxa"/>
+            </w:tcMar>
+          </w:tcPr>
+          <w:p>
             <w:r>
               <w:rPr>
                 <w:b/>
@@ -5183,9 +5023,8 @@
                 <w:sz w:val="19"/>
                 <w:szCs w:val="19"/>
               </w:rPr>
-              <w:t>Mgmt</w:t>
-            </w:r>
-            <w:proofErr w:type="spellEnd"/>
+              <w:t>Sales</w:t>
+            </w:r>
           </w:p>
         </w:tc>
         <w:tc>
@@ -5212,7 +5051,7 @@
                 <w:sz w:val="19"/>
                 <w:szCs w:val="19"/>
               </w:rPr>
-              <w:t>Inter-store transfer lag — process improvement can reduce.</w:t>
+              <w:t>66% anonymous transactions — loyalty card adoption is a process improvement.</w:t>
             </w:r>
           </w:p>
         </w:tc>
@@ -5240,25 +5079,7 @@
                 <w:sz w:val="19"/>
                 <w:szCs w:val="19"/>
               </w:rPr>
-              <w:t xml:space="preserve">Replenishment </w:t>
-            </w:r>
-            <w:proofErr w:type="gramStart"/>
-            <w:r>
-              <w:rPr>
-                <w:color w:val="8B1A1A"/>
-                <w:sz w:val="19"/>
-                <w:szCs w:val="19"/>
-              </w:rPr>
-              <w:t>trigger</w:t>
-            </w:r>
-            <w:proofErr w:type="gramEnd"/>
-            <w:r>
-              <w:rPr>
-                <w:color w:val="8B1A1A"/>
-                <w:sz w:val="19"/>
-                <w:szCs w:val="19"/>
-              </w:rPr>
-              <w:t xml:space="preserve"> unreliable. Shrinkage in Excel. Returns split across two systems. All structural — BPA-Finding-001.</w:t>
+              <w:t>No unified customer ID across systems — structural. Requires ADR-002.</w:t>
             </w:r>
           </w:p>
         </w:tc>
@@ -5273,7 +5094,7 @@
               <w:bottom w:val="single" w:sz="1" w:space="0" w:color="D0D8EC"/>
               <w:right w:val="single" w:sz="1" w:space="0" w:color="D0D8EC"/>
             </w:tcBorders>
-            <w:shd w:val="clear" w:color="auto" w:fill="FFFFFF"/>
+            <w:shd w:val="clear" w:color="auto" w:fill="EEF1F8"/>
             <w:tcMar>
               <w:top w:w="90" w:type="dxa"/>
               <w:left w:w="140" w:type="dxa"/>
@@ -5290,94 +5111,6 @@
                 <w:sz w:val="19"/>
                 <w:szCs w:val="19"/>
               </w:rPr>
-              <w:t>Sales</w:t>
-            </w:r>
-          </w:p>
-        </w:tc>
-        <w:tc>
-          <w:tcPr>
-            <w:tcW w:w="3880" w:type="dxa"/>
-            <w:tcBorders>
-              <w:top w:val="single" w:sz="1" w:space="0" w:color="D0D8EC"/>
-              <w:left w:val="single" w:sz="1" w:space="0" w:color="D0D8EC"/>
-              <w:bottom w:val="single" w:sz="1" w:space="0" w:color="D0D8EC"/>
-              <w:right w:val="single" w:sz="1" w:space="0" w:color="D0D8EC"/>
-            </w:tcBorders>
-            <w:shd w:val="clear" w:color="auto" w:fill="F0FDF4"/>
-            <w:tcMar>
-              <w:top w:w="90" w:type="dxa"/>
-              <w:left w:w="140" w:type="dxa"/>
-              <w:bottom w:w="90" w:type="dxa"/>
-              <w:right w:w="140" w:type="dxa"/>
-            </w:tcMar>
-          </w:tcPr>
-          <w:p>
-            <w:r>
-              <w:rPr>
-                <w:color w:val="166534"/>
-                <w:sz w:val="19"/>
-                <w:szCs w:val="19"/>
-              </w:rPr>
-              <w:t>66% anonymous transactions — loyalty card adoption is a process improvement.</w:t>
-            </w:r>
-          </w:p>
-        </w:tc>
-        <w:tc>
-          <w:tcPr>
-            <w:tcW w:w="3880" w:type="dxa"/>
-            <w:tcBorders>
-              <w:top w:val="single" w:sz="1" w:space="0" w:color="D0D8EC"/>
-              <w:left w:val="single" w:sz="1" w:space="0" w:color="D0D8EC"/>
-              <w:bottom w:val="single" w:sz="1" w:space="0" w:color="D0D8EC"/>
-              <w:right w:val="single" w:sz="1" w:space="0" w:color="D0D8EC"/>
-            </w:tcBorders>
-            <w:shd w:val="clear" w:color="auto" w:fill="FDF0F0"/>
-            <w:tcMar>
-              <w:top w:w="90" w:type="dxa"/>
-              <w:left w:w="140" w:type="dxa"/>
-              <w:bottom w:w="90" w:type="dxa"/>
-              <w:right w:w="140" w:type="dxa"/>
-            </w:tcMar>
-          </w:tcPr>
-          <w:p>
-            <w:r>
-              <w:rPr>
-                <w:color w:val="8B1A1A"/>
-                <w:sz w:val="19"/>
-                <w:szCs w:val="19"/>
-              </w:rPr>
-              <w:t>No unified customer ID across systems — structural. Requires ADR-002.</w:t>
-            </w:r>
-          </w:p>
-        </w:tc>
-      </w:tr>
-      <w:tr>
-        <w:tc>
-          <w:tcPr>
-            <w:tcW w:w="1600" w:type="dxa"/>
-            <w:tcBorders>
-              <w:top w:val="single" w:sz="1" w:space="0" w:color="D0D8EC"/>
-              <w:left w:val="single" w:sz="1" w:space="0" w:color="D0D8EC"/>
-              <w:bottom w:val="single" w:sz="1" w:space="0" w:color="D0D8EC"/>
-              <w:right w:val="single" w:sz="1" w:space="0" w:color="D0D8EC"/>
-            </w:tcBorders>
-            <w:shd w:val="clear" w:color="auto" w:fill="EEF1F8"/>
-            <w:tcMar>
-              <w:top w:w="90" w:type="dxa"/>
-              <w:left w:w="140" w:type="dxa"/>
-              <w:bottom w:w="90" w:type="dxa"/>
-              <w:right w:w="140" w:type="dxa"/>
-            </w:tcMar>
-          </w:tcPr>
-          <w:p>
-            <w:r>
-              <w:rPr>
-                <w:b/>
-                <w:bCs/>
-                <w:color w:val="1A2E5A"/>
-                <w:sz w:val="19"/>
-                <w:szCs w:val="19"/>
-              </w:rPr>
               <w:t>Marketing</w:t>
             </w:r>
           </w:p>
@@ -5455,25 +5188,7 @@
           <w:iCs/>
           <w:color w:val="555555"/>
         </w:rPr>
-        <w:t xml:space="preserve">The data platform can make structural problems visible and measurable. It cannot fix them. Business leadership must formally acknowledge structural problems before platform go-live to prevent </w:t>
-      </w:r>
-      <w:proofErr w:type="gramStart"/>
-      <w:r>
-        <w:rPr>
-          <w:i/>
-          <w:iCs/>
-          <w:color w:val="555555"/>
-        </w:rPr>
-        <w:t>Gold</w:t>
-      </w:r>
-      <w:proofErr w:type="gramEnd"/>
-      <w:r>
-        <w:rPr>
-          <w:i/>
-          <w:iCs/>
-          <w:color w:val="555555"/>
-        </w:rPr>
-        <w:t xml:space="preserve"> layer outputs being treated as precise when they are approximate.</w:t>
+        <w:t>The data platform can make structural problems visible and measurable. It cannot fix them. Business leadership must formally acknowledge structural problems before platform go-live to prevent Gold layer outputs being treated as precise when they are approximate.</w:t>
       </w:r>
     </w:p>
     <w:p>
@@ -5485,7 +5200,6 @@
       <w:pPr>
         <w:spacing w:before="300" w:after="120"/>
       </w:pPr>
-      <w:proofErr w:type="gramStart"/>
       <w:r>
         <w:rPr>
           <w:b/>
@@ -5494,18 +5208,7 @@
           <w:sz w:val="26"/>
           <w:szCs w:val="26"/>
         </w:rPr>
-        <w:t>4.2  ADRs</w:t>
-      </w:r>
-      <w:proofErr w:type="gramEnd"/>
-      <w:r>
-        <w:rPr>
-          <w:b/>
-          <w:bCs/>
-          <w:color w:val="1A2E5A"/>
-          <w:sz w:val="26"/>
-          <w:szCs w:val="26"/>
-        </w:rPr>
-        <w:t xml:space="preserve"> Triggered by Step 2 Interviews</w:t>
+        <w:t>4.2  ADRs Triggered by Step 2 Interviews</w:t>
       </w:r>
     </w:p>
     <w:p>
@@ -6126,29 +5829,7 @@
                 <w:sz w:val="19"/>
                 <w:szCs w:val="19"/>
               </w:rPr>
-              <w:t xml:space="preserve">CRITICAL — must be agreed before any </w:t>
-            </w:r>
-            <w:proofErr w:type="gramStart"/>
-            <w:r>
-              <w:rPr>
-                <w:b/>
-                <w:bCs/>
-                <w:color w:val="8B1A1A"/>
-                <w:sz w:val="19"/>
-                <w:szCs w:val="19"/>
-              </w:rPr>
-              <w:t>Gold</w:t>
-            </w:r>
-            <w:proofErr w:type="gramEnd"/>
-            <w:r>
-              <w:rPr>
-                <w:b/>
-                <w:bCs/>
-                <w:color w:val="8B1A1A"/>
-                <w:sz w:val="19"/>
-                <w:szCs w:val="19"/>
-              </w:rPr>
-              <w:t xml:space="preserve"> layer marketing build</w:t>
+              <w:t>CRITICAL — must be agreed before any Gold layer marketing build</w:t>
             </w:r>
           </w:p>
         </w:tc>
@@ -6319,43 +6000,7 @@
                 <w:sz w:val="19"/>
                 <w:szCs w:val="19"/>
               </w:rPr>
-              <w:t xml:space="preserve">Attribution data does not exist in any </w:t>
-            </w:r>
-            <w:proofErr w:type="spellStart"/>
-            <w:r>
-              <w:rPr>
-                <w:color w:val="1A1A1A"/>
-                <w:sz w:val="19"/>
-                <w:szCs w:val="19"/>
-              </w:rPr>
-              <w:t>RetailSphere</w:t>
-            </w:r>
-            <w:proofErr w:type="spellEnd"/>
-            <w:r>
-              <w:rPr>
-                <w:color w:val="1A1A1A"/>
-                <w:sz w:val="19"/>
-                <w:szCs w:val="19"/>
-              </w:rPr>
-              <w:t xml:space="preserve"> source system. The data platform will create it for the first time. </w:t>
-            </w:r>
-            <w:proofErr w:type="spellStart"/>
-            <w:r>
-              <w:rPr>
-                <w:color w:val="1A1A1A"/>
-                <w:sz w:val="19"/>
-                <w:szCs w:val="19"/>
-              </w:rPr>
-              <w:t>RetailSphere</w:t>
-            </w:r>
-            <w:proofErr w:type="spellEnd"/>
-            <w:r>
-              <w:rPr>
-                <w:color w:val="1A1A1A"/>
-                <w:sz w:val="19"/>
-                <w:szCs w:val="19"/>
-              </w:rPr>
-              <w:t xml:space="preserve"> will spend R8.3M annually based on numbers that have no external validation source. ADR-006 must be formally agreed and signed by the CCO before any Gold layer marketing build begins.</w:t>
+              <w:t>Attribution data does not exist in any RetailSphere source system. The data platform will create it for the first time. RetailSphere will spend R8.3M annually based on numbers that have no external validation source. ADR-006 must be formally agreed and signed by the CCO before any Gold layer marketing build begins.</w:t>
             </w:r>
           </w:p>
         </w:tc>
@@ -6416,6 +6061,7 @@
                 <w:sz w:val="19"/>
                 <w:szCs w:val="19"/>
               </w:rPr>
+              <w:lastRenderedPageBreak/>
               <w:t>BPA-FINDING-003 — Domain Ownership Gap: Marketing vs Customer Loyalty</w:t>
             </w:r>
           </w:p>
@@ -6521,21 +6167,7 @@
         <w:rPr>
           <w:color w:val="1A1A1A"/>
         </w:rPr>
-        <w:t xml:space="preserve">6.  Initiate ADR-006 formal write-up — do not build </w:t>
-      </w:r>
-      <w:proofErr w:type="gramStart"/>
-      <w:r>
-        <w:rPr>
-          <w:color w:val="1A1A1A"/>
-        </w:rPr>
-        <w:t>Gold</w:t>
-      </w:r>
-      <w:proofErr w:type="gramEnd"/>
-      <w:r>
-        <w:rPr>
-          <w:color w:val="1A1A1A"/>
-        </w:rPr>
-        <w:t xml:space="preserve"> layer marketing until complete.</w:t>
+        <w:t>6.  Initiate ADR-006 formal write-up — do not build Gold layer marketing until complete.</w:t>
       </w:r>
     </w:p>
     <w:p>
@@ -6568,29 +6200,7 @@
           <w:sz w:val="16"/>
           <w:szCs w:val="16"/>
         </w:rPr>
-        <w:t xml:space="preserve">BPA-001 Draft v0.3 | </w:t>
-      </w:r>
-      <w:proofErr w:type="spellStart"/>
-      <w:r>
-        <w:rPr>
-          <w:i/>
-          <w:iCs/>
-          <w:color w:val="555555"/>
-          <w:sz w:val="16"/>
-          <w:szCs w:val="16"/>
-        </w:rPr>
-        <w:t>RetailSphere</w:t>
-      </w:r>
-      <w:proofErr w:type="spellEnd"/>
-      <w:r>
-        <w:rPr>
-          <w:i/>
-          <w:iCs/>
-          <w:color w:val="555555"/>
-          <w:sz w:val="16"/>
-          <w:szCs w:val="16"/>
-        </w:rPr>
-        <w:t xml:space="preserve"> Data Platform Programme | Confidential</w:t>
+        <w:t>BPA-001 Draft v0.3 | RetailSphere Data Platform Programme | Confidential</w:t>
       </w:r>
     </w:p>
     <w:sectPr>
@@ -6836,7 +6446,6 @@
           </w:tcBorders>
         </w:tcPr>
         <w:p>
-          <w:proofErr w:type="spellStart"/>
           <w:r>
             <w:rPr>
               <w:b/>
@@ -6845,18 +6454,7 @@
               <w:sz w:val="18"/>
               <w:szCs w:val="18"/>
             </w:rPr>
-            <w:t>RetailSphere</w:t>
-          </w:r>
-          <w:proofErr w:type="spellEnd"/>
-          <w:r>
-            <w:rPr>
-              <w:b/>
-              <w:bCs/>
-              <w:color w:val="1A2E5A"/>
-              <w:sz w:val="18"/>
-              <w:szCs w:val="18"/>
-            </w:rPr>
-            <w:t xml:space="preserve"> (Pty) Ltd — Data Platform Programme</w:t>
+            <w:t>RetailSphere (Pty) Ltd — Data Platform Programme</w:t>
           </w:r>
         </w:p>
       </w:tc>
@@ -6874,23 +6472,13 @@
           <w:pPr>
             <w:jc w:val="right"/>
           </w:pPr>
-          <w:proofErr w:type="gramStart"/>
           <w:r>
             <w:rPr>
               <w:color w:val="555555"/>
               <w:sz w:val="16"/>
               <w:szCs w:val="16"/>
             </w:rPr>
-            <w:t>CONFIDENTIAL  |</w:t>
-          </w:r>
-          <w:proofErr w:type="gramEnd"/>
-          <w:r>
-            <w:rPr>
-              <w:color w:val="555555"/>
-              <w:sz w:val="16"/>
-              <w:szCs w:val="16"/>
-            </w:rPr>
-            <w:t xml:space="preserve">  DRAFT v0.3</w:t>
+            <w:t>CONFIDENTIAL  |  DRAFT v0.3</w:t>
           </w:r>
         </w:p>
       </w:tc>

</xml_diff>

<commit_message>
Prepared this section of the document 3.5 Finance — Johan van der Merwe, Group Financial Controller, so I can start with Johan's Profile Overview.
</commit_message>
<xml_diff>
--- a/docs/02-business-process-analysis/RetailSphere_BPA001_Draft_v0.3.docx
+++ b/docs/02-business-process-analysis/RetailSphere_BPA001_Draft_v0.3.docx
@@ -490,7 +490,21 @@
         <w:rPr>
           <w:color w:val="1A1A1A"/>
         </w:rPr>
-        <w:t>This document captures findings from Step 2 of the RetailSphere Data Platform Design Process — Business Process Analysis. The purpose of Step 2 is to understand what each business domain actually does, what decisions stakeholders make daily, what questions they cannot currently answer, and what good looks like in 12 months. These findings drive the functional requirements in Step 3.</w:t>
+        <w:t xml:space="preserve">This document captures findings from Step 2 of the </w:t>
+      </w:r>
+      <w:proofErr w:type="spellStart"/>
+      <w:r>
+        <w:rPr>
+          <w:color w:val="1A1A1A"/>
+        </w:rPr>
+        <w:t>RetailSphere</w:t>
+      </w:r>
+      <w:proofErr w:type="spellEnd"/>
+      <w:r>
+        <w:rPr>
+          <w:color w:val="1A1A1A"/>
+        </w:rPr>
+        <w:t xml:space="preserve"> Data Platform Design Process — Business Process Analysis. The purpose of Step 2 is to understand what each business domain actually does, what decisions stakeholders make daily, what questions they cannot currently answer, and what good looks like in 12 months. These findings drive the functional requirements in Step 3.</w:t>
       </w:r>
     </w:p>
     <w:p>
@@ -884,8 +898,18 @@
                 <w:sz w:val="19"/>
                 <w:szCs w:val="19"/>
               </w:rPr>
-              <w:t>Inventory Mgmt</w:t>
-            </w:r>
+              <w:t xml:space="preserve">Inventory </w:t>
+            </w:r>
+            <w:proofErr w:type="spellStart"/>
+            <w:r>
+              <w:rPr>
+                <w:color w:val="1A1A1A"/>
+                <w:sz w:val="19"/>
+                <w:szCs w:val="19"/>
+              </w:rPr>
+              <w:t>Mgmt</w:t>
+            </w:r>
+            <w:proofErr w:type="spellEnd"/>
           </w:p>
         </w:tc>
         <w:tc>
@@ -1469,6 +1493,7 @@
         </w:pBdr>
         <w:spacing w:before="200" w:after="120"/>
       </w:pPr>
+      <w:proofErr w:type="gramStart"/>
       <w:r>
         <w:rPr>
           <w:b/>
@@ -1477,7 +1502,18 @@
           <w:sz w:val="26"/>
           <w:szCs w:val="26"/>
         </w:rPr>
-        <w:t>3.1  Procurement — Sipho Dlamini, Head of Procurement</w:t>
+        <w:t>3.1  Procurement</w:t>
+      </w:r>
+      <w:proofErr w:type="gramEnd"/>
+      <w:r>
+        <w:rPr>
+          <w:b/>
+          <w:bCs/>
+          <w:color w:val="1A2E5A"/>
+          <w:sz w:val="26"/>
+          <w:szCs w:val="26"/>
+        </w:rPr>
+        <w:t xml:space="preserve"> — Sipho Dlamini, Head of Procurement</w:t>
       </w:r>
     </w:p>
     <w:p>
@@ -1519,7 +1555,35 @@
         <w:rPr>
           <w:color w:val="1A1A1A"/>
         </w:rPr>
-        <w:t>The procurement process at RetailSphere follows five stages: (1) Demand signal — store POS flags low stock or planning team runs SAP replenishment report, triggering a Purchase Requisition. (2) Purchase Order creation — buyer selects supplier and raises PO. This decision is undocumented and lives in the buyer's head. (3) Supplier confirmation — supplier confirms via email; team manually updates SAP. (4) Goods Receipt — warehouse team captures GRN in SAP against PO. Currently batch-captured at end of day, creating timestamp unreliability. (5) Invoice matching — three-way match in SAP (PO + GRN + invoice). Exceptions managed in Excel. (6) Payment — SAP payment run on 30/60/90 day supplier terms.</w:t>
+        <w:t xml:space="preserve">The procurement process at </w:t>
+      </w:r>
+      <w:proofErr w:type="spellStart"/>
+      <w:r>
+        <w:rPr>
+          <w:color w:val="1A1A1A"/>
+        </w:rPr>
+        <w:t>RetailSphere</w:t>
+      </w:r>
+      <w:proofErr w:type="spellEnd"/>
+      <w:r>
+        <w:rPr>
+          <w:color w:val="1A1A1A"/>
+        </w:rPr>
+        <w:t xml:space="preserve"> follows five stages: (1) Demand signal — store POS flags low stock or planning team runs SAP replenishment report, triggering a Purchase Requisition. (2) Purchase Order creation — buyer selects supplier and raises PO. This decision is undocumented and lives in the buyer's head. (3) Supplier confirmation — supplier confirms via email; team manually updates SAP. (4) Goods Receipt — warehouse team captures GRN in SAP against PO. Currently batch-captured at end of day, creating timestamp unreliability. (5) Invoice matching — three-way match in SAP (PO + GRN + invoice). Exceptions managed in Excel. (6) Payment — SAP payment run on 30/60/</w:t>
+      </w:r>
+      <w:proofErr w:type="gramStart"/>
+      <w:r>
+        <w:rPr>
+          <w:color w:val="1A1A1A"/>
+        </w:rPr>
+        <w:t>90 day</w:t>
+      </w:r>
+      <w:proofErr w:type="gramEnd"/>
+      <w:r>
+        <w:rPr>
+          <w:color w:val="1A1A1A"/>
+        </w:rPr>
+        <w:t xml:space="preserve"> supplier terms.</w:t>
       </w:r>
     </w:p>
     <w:p>
@@ -1572,7 +1636,21 @@
         <w:rPr>
           <w:color w:val="1A1A1A"/>
         </w:rPr>
-        <w:t>Monthly: Board reporting — procurement savings as % of total spend. Currently calculated manually over 3 days in Excel.</w:t>
+        <w:t xml:space="preserve">Monthly: Board reporting — procurement savings as % of total </w:t>
+      </w:r>
+      <w:proofErr w:type="gramStart"/>
+      <w:r>
+        <w:rPr>
+          <w:color w:val="1A1A1A"/>
+        </w:rPr>
+        <w:t>spend</w:t>
+      </w:r>
+      <w:proofErr w:type="gramEnd"/>
+      <w:r>
+        <w:rPr>
+          <w:color w:val="1A1A1A"/>
+        </w:rPr>
+        <w:t>. Currently calculated manually over 3 days in Excel.</w:t>
       </w:r>
     </w:p>
     <w:p>
@@ -1822,7 +1900,79 @@
                 <w:sz w:val="19"/>
                 <w:szCs w:val="19"/>
               </w:rPr>
-              <w:t>Goods are batch-captured at end of day. SAP posting timestamp ≠ actual delivery time. Bronze layer workaround: four timestamp columns per GRN record — sap_posting_timestamp, claimed_delivery_date, grn_capture_timestamp, data_ingested_timestamp.</w:t>
+              <w:t xml:space="preserve">Goods are batch-captured at end of day. SAP posting timestamp ≠ actual delivery time. Bronze layer workaround: four timestamp columns per GRN record — </w:t>
+            </w:r>
+            <w:proofErr w:type="spellStart"/>
+            <w:r>
+              <w:rPr>
+                <w:color w:val="1A1A1A"/>
+                <w:sz w:val="19"/>
+                <w:szCs w:val="19"/>
+              </w:rPr>
+              <w:t>sap_posting_timestamp</w:t>
+            </w:r>
+            <w:proofErr w:type="spellEnd"/>
+            <w:r>
+              <w:rPr>
+                <w:color w:val="1A1A1A"/>
+                <w:sz w:val="19"/>
+                <w:szCs w:val="19"/>
+              </w:rPr>
+              <w:t xml:space="preserve">, </w:t>
+            </w:r>
+            <w:proofErr w:type="spellStart"/>
+            <w:r>
+              <w:rPr>
+                <w:color w:val="1A1A1A"/>
+                <w:sz w:val="19"/>
+                <w:szCs w:val="19"/>
+              </w:rPr>
+              <w:t>claimed_delivery_date</w:t>
+            </w:r>
+            <w:proofErr w:type="spellEnd"/>
+            <w:r>
+              <w:rPr>
+                <w:color w:val="1A1A1A"/>
+                <w:sz w:val="19"/>
+                <w:szCs w:val="19"/>
+              </w:rPr>
+              <w:t xml:space="preserve">, </w:t>
+            </w:r>
+            <w:proofErr w:type="spellStart"/>
+            <w:r>
+              <w:rPr>
+                <w:color w:val="1A1A1A"/>
+                <w:sz w:val="19"/>
+                <w:szCs w:val="19"/>
+              </w:rPr>
+              <w:t>grn_capture_timestamp</w:t>
+            </w:r>
+            <w:proofErr w:type="spellEnd"/>
+            <w:r>
+              <w:rPr>
+                <w:color w:val="1A1A1A"/>
+                <w:sz w:val="19"/>
+                <w:szCs w:val="19"/>
+              </w:rPr>
+              <w:t xml:space="preserve">, </w:t>
+            </w:r>
+            <w:proofErr w:type="spellStart"/>
+            <w:r>
+              <w:rPr>
+                <w:color w:val="1A1A1A"/>
+                <w:sz w:val="19"/>
+                <w:szCs w:val="19"/>
+              </w:rPr>
+              <w:t>data_ingested_timestamp</w:t>
+            </w:r>
+            <w:proofErr w:type="spellEnd"/>
+            <w:r>
+              <w:rPr>
+                <w:color w:val="1A1A1A"/>
+                <w:sz w:val="19"/>
+                <w:szCs w:val="19"/>
+              </w:rPr>
+              <w:t>.</w:t>
             </w:r>
           </w:p>
         </w:tc>
@@ -2052,6 +2202,7 @@
         </w:pBdr>
         <w:spacing w:before="200" w:after="120"/>
       </w:pPr>
+      <w:proofErr w:type="gramStart"/>
       <w:r>
         <w:rPr>
           <w:b/>
@@ -2060,7 +2211,18 @@
           <w:sz w:val="26"/>
           <w:szCs w:val="26"/>
         </w:rPr>
-        <w:t>3.2  Inventory Management — Zanele Mokoena, National Inventory Manager</w:t>
+        <w:t>3.2  Inventory</w:t>
+      </w:r>
+      <w:proofErr w:type="gramEnd"/>
+      <w:r>
+        <w:rPr>
+          <w:b/>
+          <w:bCs/>
+          <w:color w:val="1A2E5A"/>
+          <w:sz w:val="26"/>
+          <w:szCs w:val="26"/>
+        </w:rPr>
+        <w:t xml:space="preserve"> Management — Zanele Mokoena, National Inventory Manager</w:t>
       </w:r>
     </w:p>
     <w:p>
@@ -3298,7 +3460,29 @@
                 <w:sz w:val="19"/>
                 <w:szCs w:val="19"/>
               </w:rPr>
-              <w:t>This finding must be formally acknowledged by the business before the platform goes live. Failure to do so creates a risk that leadership treats Gold layer inventory numbers as precise when they are estimates. Contrast with Procurement: Procurement problems are process-driven and fixable. Inventory problems are structural and require operational change beyond the data platform scope.</w:t>
+              <w:t xml:space="preserve">This finding must be formally acknowledged by the business before the platform goes live. Failure to do so creates a risk that leadership treats </w:t>
+            </w:r>
+            <w:proofErr w:type="gramStart"/>
+            <w:r>
+              <w:rPr>
+                <w:b/>
+                <w:bCs/>
+                <w:color w:val="8B1A1A"/>
+                <w:sz w:val="19"/>
+                <w:szCs w:val="19"/>
+              </w:rPr>
+              <w:t>Gold</w:t>
+            </w:r>
+            <w:proofErr w:type="gramEnd"/>
+            <w:r>
+              <w:rPr>
+                <w:b/>
+                <w:bCs/>
+                <w:color w:val="8B1A1A"/>
+                <w:sz w:val="19"/>
+                <w:szCs w:val="19"/>
+              </w:rPr>
+              <w:t xml:space="preserve"> layer inventory numbers as precise when they are estimates. Contrast with Procurement: Procurement problems are process-driven and fixable. Inventory problems are structural and require operational change beyond the data platform scope.</w:t>
             </w:r>
           </w:p>
         </w:tc>
@@ -3404,6 +3588,7 @@
         </w:pBdr>
         <w:spacing w:before="200" w:after="120"/>
       </w:pPr>
+      <w:proofErr w:type="gramStart"/>
       <w:r>
         <w:rPr>
           <w:b/>
@@ -3413,7 +3598,18 @@
           <w:szCs w:val="26"/>
         </w:rPr>
         <w:lastRenderedPageBreak/>
-        <w:t>3.3  Sales &amp; Marketing — Rethabile Sithole, Chief Commercial Officer</w:t>
+        <w:t>3.3  Sales</w:t>
+      </w:r>
+      <w:proofErr w:type="gramEnd"/>
+      <w:r>
+        <w:rPr>
+          <w:b/>
+          <w:bCs/>
+          <w:color w:val="1A2E5A"/>
+          <w:sz w:val="26"/>
+          <w:szCs w:val="26"/>
+        </w:rPr>
+        <w:t xml:space="preserve"> &amp; Marketing — Rethabile Sithole, Chief Commercial Officer</w:t>
       </w:r>
     </w:p>
     <w:p>
@@ -3583,7 +3779,25 @@
                 <w:sz w:val="19"/>
                 <w:szCs w:val="19"/>
               </w:rPr>
-              <w:t>Loyalty team defines lapsed as 12 months no purchase. E-commerce team defines it as 90 days. Store ops has no definition. Board-level retention rate is an educated guess. Business definition agreed in interview: 6 months no engagement signal (purchase, browse, email open, store visit).</w:t>
+              <w:t xml:space="preserve">Loyalty team defines lapsed as 12 months no purchase. E-commerce team defines it as 90 days. Store ops </w:t>
+            </w:r>
+            <w:proofErr w:type="gramStart"/>
+            <w:r>
+              <w:rPr>
+                <w:color w:val="1A1A1A"/>
+                <w:sz w:val="19"/>
+                <w:szCs w:val="19"/>
+              </w:rPr>
+              <w:t>has</w:t>
+            </w:r>
+            <w:proofErr w:type="gramEnd"/>
+            <w:r>
+              <w:rPr>
+                <w:color w:val="1A1A1A"/>
+                <w:sz w:val="19"/>
+                <w:szCs w:val="19"/>
+              </w:rPr>
+              <w:t xml:space="preserve"> no definition. Board-level retention rate is an educated guess. Business definition agreed in interview: 6 months no engagement signal (purchase, browse, email open, store visit).</w:t>
             </w:r>
           </w:p>
         </w:tc>
@@ -3821,7 +4035,21 @@
         <w:rPr>
           <w:color w:val="1A1A1A"/>
         </w:rPr>
-        <w:t>Meta Business Manager — paid social spend and platform attribution data.</w:t>
+        <w:t xml:space="preserve">Meta Business Manager — paid social </w:t>
+      </w:r>
+      <w:proofErr w:type="gramStart"/>
+      <w:r>
+        <w:rPr>
+          <w:color w:val="1A1A1A"/>
+        </w:rPr>
+        <w:t>spend</w:t>
+      </w:r>
+      <w:proofErr w:type="gramEnd"/>
+      <w:r>
+        <w:rPr>
+          <w:color w:val="1A1A1A"/>
+        </w:rPr>
+        <w:t xml:space="preserve"> and platform attribution data.</w:t>
       </w:r>
     </w:p>
     <w:p>
@@ -3892,7 +4120,21 @@
         <w:rPr>
           <w:color w:val="1A1A1A"/>
         </w:rPr>
-        <w:t>ADR-006 raised: Marketing Attribution Logic — attribution window, model type, and cross-channel weighting must be agreed before Gold layer marketing build.</w:t>
+        <w:t xml:space="preserve">ADR-006 raised: Marketing Attribution Logic — attribution window, model type, and cross-channel weighting must be agreed before </w:t>
+      </w:r>
+      <w:proofErr w:type="gramStart"/>
+      <w:r>
+        <w:rPr>
+          <w:color w:val="1A1A1A"/>
+        </w:rPr>
+        <w:t>Gold</w:t>
+      </w:r>
+      <w:proofErr w:type="gramEnd"/>
+      <w:r>
+        <w:rPr>
+          <w:color w:val="1A1A1A"/>
+        </w:rPr>
+        <w:t xml:space="preserve"> layer marketing build.</w:t>
       </w:r>
     </w:p>
     <w:p>
@@ -4318,8 +4560,6 @@
           <w:bottom w:val="single" w:sz="2" w:space="4" w:color="D0D8EC"/>
         </w:pBdr>
         <w:spacing w:before="200" w:after="120"/>
-      </w:pPr>
-      <w:r>
         <w:rPr>
           <w:b/>
           <w:bCs/>
@@ -4327,98 +4567,37 @@
           <w:sz w:val="26"/>
           <w:szCs w:val="26"/>
         </w:rPr>
-        <w:t>3.5  Finance — Johan van der Merwe, Group Financial Controller</w:t>
-      </w:r>
-    </w:p>
-    <w:p>
-      <w:pPr>
-        <w:spacing w:before="160"/>
-      </w:pPr>
-    </w:p>
-    <w:tbl>
-      <w:tblPr>
-        <w:tblW w:w="9360" w:type="dxa"/>
-        <w:tblBorders>
-          <w:top w:val="single" w:sz="4" w:space="0" w:color="auto"/>
-          <w:left w:val="single" w:sz="4" w:space="0" w:color="auto"/>
-          <w:bottom w:val="single" w:sz="4" w:space="0" w:color="auto"/>
-          <w:right w:val="single" w:sz="4" w:space="0" w:color="auto"/>
-          <w:insideH w:val="single" w:sz="4" w:space="0" w:color="auto"/>
-          <w:insideV w:val="single" w:sz="4" w:space="0" w:color="auto"/>
-        </w:tblBorders>
-        <w:tblCellMar>
-          <w:left w:w="10" w:type="dxa"/>
-          <w:right w:w="10" w:type="dxa"/>
-        </w:tblCellMar>
-        <w:tblLook w:val="04A0" w:firstRow="1" w:lastRow="0" w:firstColumn="1" w:lastColumn="0" w:noHBand="0" w:noVBand="1"/>
-      </w:tblPr>
-      <w:tblGrid>
-        <w:gridCol w:w="9360"/>
-      </w:tblGrid>
-      <w:tr>
-        <w:tc>
-          <w:tcPr>
-            <w:tcW w:w="9360" w:type="dxa"/>
-            <w:tcBorders>
-              <w:top w:val="single" w:sz="3" w:space="0" w:color="7A5C00"/>
-              <w:left w:val="thick" w:sz="6" w:space="0" w:color="7A5C00"/>
-              <w:bottom w:val="single" w:sz="1" w:space="0" w:color="7A5C00"/>
-              <w:right w:val="single" w:sz="1" w:space="0" w:color="7A5C00"/>
-            </w:tcBorders>
-            <w:shd w:val="clear" w:color="auto" w:fill="FDF6E3"/>
-            <w:tcMar>
-              <w:top w:w="120" w:type="dxa"/>
-              <w:left w:w="180" w:type="dxa"/>
-              <w:bottom w:w="120" w:type="dxa"/>
-              <w:right w:w="180" w:type="dxa"/>
-            </w:tcMar>
-          </w:tcPr>
-          <w:p>
-            <w:pPr>
-              <w:spacing w:before="40" w:after="40"/>
-            </w:pPr>
-            <w:r>
-              <w:rPr>
-                <w:b/>
-                <w:bCs/>
-                <w:color w:val="7A5C00"/>
-                <w:sz w:val="19"/>
-                <w:szCs w:val="19"/>
-              </w:rPr>
-              <w:t>Interview Pending — Finance</w:t>
-            </w:r>
-          </w:p>
-          <w:p>
-            <w:pPr>
-              <w:spacing w:before="40" w:after="40"/>
-            </w:pPr>
-            <w:r>
-              <w:rPr>
-                <w:color w:val="1A1A1A"/>
-                <w:sz w:val="19"/>
-                <w:szCs w:val="19"/>
-              </w:rPr>
-              <w:t>Process Owner: Johan van der Merwe — Group Financial Controller</w:t>
-            </w:r>
-          </w:p>
-          <w:p>
-            <w:pPr>
-              <w:spacing w:before="40" w:after="40"/>
-            </w:pPr>
-            <w:r>
-              <w:rPr>
-                <w:i/>
-                <w:iCs/>
-                <w:color w:val="555555"/>
-                <w:sz w:val="19"/>
-                <w:szCs w:val="19"/>
-              </w:rPr>
-              <w:t>This section will be completed following the scheduled stakeholder interview. Placeholder sections are included to maintain document structure.</w:t>
-            </w:r>
-          </w:p>
-        </w:tc>
-      </w:tr>
-    </w:tbl>
+      </w:pPr>
+    </w:p>
+    <w:p>
+      <w:pPr>
+        <w:pBdr>
+          <w:bottom w:val="single" w:sz="2" w:space="4" w:color="D0D8EC"/>
+        </w:pBdr>
+        <w:spacing w:before="200" w:after="120"/>
+      </w:pPr>
+      <w:r>
+        <w:rPr>
+          <w:b/>
+          <w:bCs/>
+          <w:color w:val="1A2E5A"/>
+          <w:sz w:val="26"/>
+          <w:szCs w:val="26"/>
+        </w:rPr>
+        <w:lastRenderedPageBreak/>
+        <w:t>3.5 Finance</w:t>
+      </w:r>
+      <w:r>
+        <w:rPr>
+          <w:b/>
+          <w:bCs/>
+          <w:color w:val="1A2E5A"/>
+          <w:sz w:val="26"/>
+          <w:szCs w:val="26"/>
+        </w:rPr>
+        <w:t xml:space="preserve"> — Johan van der Merwe, Group Financial Controller</w:t>
+      </w:r>
+    </w:p>
     <w:p>
       <w:pPr>
         <w:spacing w:before="120"/>
@@ -4441,16 +4620,8 @@
     </w:p>
     <w:p>
       <w:pPr>
-        <w:spacing w:before="80" w:after="80"/>
-      </w:pPr>
-      <w:r>
-        <w:rPr>
-          <w:i/>
-          <w:iCs/>
-          <w:color w:val="555555"/>
-        </w:rPr>
-        <w:t>To be completed following interview.</w:t>
-      </w:r>
+        <w:spacing w:before="200" w:after="80"/>
+      </w:pPr>
     </w:p>
     <w:p>
       <w:pPr>
@@ -4685,7 +4856,17 @@
           <w:sz w:val="26"/>
           <w:szCs w:val="26"/>
         </w:rPr>
-        <w:t>4.1  Structural vs Process Problems — Critical Distinction</w:t>
+        <w:t>4.1 Structural</w:t>
+      </w:r>
+      <w:r>
+        <w:rPr>
+          <w:b/>
+          <w:bCs/>
+          <w:color w:val="1A2E5A"/>
+          <w:sz w:val="26"/>
+          <w:szCs w:val="26"/>
+        </w:rPr>
+        <w:t xml:space="preserve"> vs Process Problems — Critical Distinction</w:t>
       </w:r>
     </w:p>
     <w:p>
@@ -4934,87 +5115,9 @@
                 <w:sz w:val="19"/>
                 <w:szCs w:val="19"/>
               </w:rPr>
-              <w:lastRenderedPageBreak/>
-              <w:t>Inventory Mgmt</w:t>
-            </w:r>
-          </w:p>
-        </w:tc>
-        <w:tc>
-          <w:tcPr>
-            <w:tcW w:w="3880" w:type="dxa"/>
-            <w:tcBorders>
-              <w:top w:val="single" w:sz="1" w:space="0" w:color="D0D8EC"/>
-              <w:left w:val="single" w:sz="1" w:space="0" w:color="D0D8EC"/>
-              <w:bottom w:val="single" w:sz="1" w:space="0" w:color="D0D8EC"/>
-              <w:right w:val="single" w:sz="1" w:space="0" w:color="D0D8EC"/>
-            </w:tcBorders>
-            <w:shd w:val="clear" w:color="auto" w:fill="F0FDF4"/>
-            <w:tcMar>
-              <w:top w:w="90" w:type="dxa"/>
-              <w:left w:w="140" w:type="dxa"/>
-              <w:bottom w:w="90" w:type="dxa"/>
-              <w:right w:w="140" w:type="dxa"/>
-            </w:tcMar>
-          </w:tcPr>
-          <w:p>
-            <w:r>
-              <w:rPr>
-                <w:color w:val="166534"/>
-                <w:sz w:val="19"/>
-                <w:szCs w:val="19"/>
-              </w:rPr>
-              <w:t>Inter-store transfer lag — process improvement can reduce.</w:t>
-            </w:r>
-          </w:p>
-        </w:tc>
-        <w:tc>
-          <w:tcPr>
-            <w:tcW w:w="3880" w:type="dxa"/>
-            <w:tcBorders>
-              <w:top w:val="single" w:sz="1" w:space="0" w:color="D0D8EC"/>
-              <w:left w:val="single" w:sz="1" w:space="0" w:color="D0D8EC"/>
-              <w:bottom w:val="single" w:sz="1" w:space="0" w:color="D0D8EC"/>
-              <w:right w:val="single" w:sz="1" w:space="0" w:color="D0D8EC"/>
-            </w:tcBorders>
-            <w:shd w:val="clear" w:color="auto" w:fill="FDF0F0"/>
-            <w:tcMar>
-              <w:top w:w="90" w:type="dxa"/>
-              <w:left w:w="140" w:type="dxa"/>
-              <w:bottom w:w="90" w:type="dxa"/>
-              <w:right w:w="140" w:type="dxa"/>
-            </w:tcMar>
-          </w:tcPr>
-          <w:p>
-            <w:r>
-              <w:rPr>
-                <w:color w:val="8B1A1A"/>
-                <w:sz w:val="19"/>
-                <w:szCs w:val="19"/>
-              </w:rPr>
-              <w:t>Replenishment trigger unreliable. Shrinkage in Excel. Returns split across two systems. All structural — BPA-Finding-001.</w:t>
-            </w:r>
-          </w:p>
-        </w:tc>
-      </w:tr>
-      <w:tr>
-        <w:tc>
-          <w:tcPr>
-            <w:tcW w:w="1600" w:type="dxa"/>
-            <w:tcBorders>
-              <w:top w:val="single" w:sz="1" w:space="0" w:color="D0D8EC"/>
-              <w:left w:val="single" w:sz="1" w:space="0" w:color="D0D8EC"/>
-              <w:bottom w:val="single" w:sz="1" w:space="0" w:color="D0D8EC"/>
-              <w:right w:val="single" w:sz="1" w:space="0" w:color="D0D8EC"/>
-            </w:tcBorders>
-            <w:shd w:val="clear" w:color="auto" w:fill="FFFFFF"/>
-            <w:tcMar>
-              <w:top w:w="90" w:type="dxa"/>
-              <w:left w:w="140" w:type="dxa"/>
-              <w:bottom w:w="90" w:type="dxa"/>
-              <w:right w:w="140" w:type="dxa"/>
-            </w:tcMar>
-          </w:tcPr>
-          <w:p>
+              <w:t xml:space="preserve">Inventory </w:t>
+            </w:r>
+            <w:proofErr w:type="spellStart"/>
             <w:r>
               <w:rPr>
                 <w:b/>
@@ -5023,8 +5126,9 @@
                 <w:sz w:val="19"/>
                 <w:szCs w:val="19"/>
               </w:rPr>
-              <w:t>Sales</w:t>
-            </w:r>
+              <w:t>Mgmt</w:t>
+            </w:r>
+            <w:proofErr w:type="spellEnd"/>
           </w:p>
         </w:tc>
         <w:tc>
@@ -5051,7 +5155,7 @@
                 <w:sz w:val="19"/>
                 <w:szCs w:val="19"/>
               </w:rPr>
-              <w:t>66% anonymous transactions — loyalty card adoption is a process improvement.</w:t>
+              <w:t>Inter-store transfer lag — process improvement can reduce.</w:t>
             </w:r>
           </w:p>
         </w:tc>
@@ -5079,7 +5183,25 @@
                 <w:sz w:val="19"/>
                 <w:szCs w:val="19"/>
               </w:rPr>
-              <w:t>No unified customer ID across systems — structural. Requires ADR-002.</w:t>
+              <w:t xml:space="preserve">Replenishment </w:t>
+            </w:r>
+            <w:proofErr w:type="gramStart"/>
+            <w:r>
+              <w:rPr>
+                <w:color w:val="8B1A1A"/>
+                <w:sz w:val="19"/>
+                <w:szCs w:val="19"/>
+              </w:rPr>
+              <w:t>trigger</w:t>
+            </w:r>
+            <w:proofErr w:type="gramEnd"/>
+            <w:r>
+              <w:rPr>
+                <w:color w:val="8B1A1A"/>
+                <w:sz w:val="19"/>
+                <w:szCs w:val="19"/>
+              </w:rPr>
+              <w:t xml:space="preserve"> unreliable. Shrinkage in Excel. Returns split across two systems. All structural — BPA-Finding-001.</w:t>
             </w:r>
           </w:p>
         </w:tc>
@@ -5094,7 +5216,7 @@
               <w:bottom w:val="single" w:sz="1" w:space="0" w:color="D0D8EC"/>
               <w:right w:val="single" w:sz="1" w:space="0" w:color="D0D8EC"/>
             </w:tcBorders>
-            <w:shd w:val="clear" w:color="auto" w:fill="EEF1F8"/>
+            <w:shd w:val="clear" w:color="auto" w:fill="FFFFFF"/>
             <w:tcMar>
               <w:top w:w="90" w:type="dxa"/>
               <w:left w:w="140" w:type="dxa"/>
@@ -5111,6 +5233,95 @@
                 <w:sz w:val="19"/>
                 <w:szCs w:val="19"/>
               </w:rPr>
+              <w:t>Sales</w:t>
+            </w:r>
+          </w:p>
+        </w:tc>
+        <w:tc>
+          <w:tcPr>
+            <w:tcW w:w="3880" w:type="dxa"/>
+            <w:tcBorders>
+              <w:top w:val="single" w:sz="1" w:space="0" w:color="D0D8EC"/>
+              <w:left w:val="single" w:sz="1" w:space="0" w:color="D0D8EC"/>
+              <w:bottom w:val="single" w:sz="1" w:space="0" w:color="D0D8EC"/>
+              <w:right w:val="single" w:sz="1" w:space="0" w:color="D0D8EC"/>
+            </w:tcBorders>
+            <w:shd w:val="clear" w:color="auto" w:fill="F0FDF4"/>
+            <w:tcMar>
+              <w:top w:w="90" w:type="dxa"/>
+              <w:left w:w="140" w:type="dxa"/>
+              <w:bottom w:w="90" w:type="dxa"/>
+              <w:right w:w="140" w:type="dxa"/>
+            </w:tcMar>
+          </w:tcPr>
+          <w:p>
+            <w:r>
+              <w:rPr>
+                <w:color w:val="166534"/>
+                <w:sz w:val="19"/>
+                <w:szCs w:val="19"/>
+              </w:rPr>
+              <w:t>66% anonymous transactions — loyalty card adoption is a process improvement.</w:t>
+            </w:r>
+          </w:p>
+        </w:tc>
+        <w:tc>
+          <w:tcPr>
+            <w:tcW w:w="3880" w:type="dxa"/>
+            <w:tcBorders>
+              <w:top w:val="single" w:sz="1" w:space="0" w:color="D0D8EC"/>
+              <w:left w:val="single" w:sz="1" w:space="0" w:color="D0D8EC"/>
+              <w:bottom w:val="single" w:sz="1" w:space="0" w:color="D0D8EC"/>
+              <w:right w:val="single" w:sz="1" w:space="0" w:color="D0D8EC"/>
+            </w:tcBorders>
+            <w:shd w:val="clear" w:color="auto" w:fill="FDF0F0"/>
+            <w:tcMar>
+              <w:top w:w="90" w:type="dxa"/>
+              <w:left w:w="140" w:type="dxa"/>
+              <w:bottom w:w="90" w:type="dxa"/>
+              <w:right w:w="140" w:type="dxa"/>
+            </w:tcMar>
+          </w:tcPr>
+          <w:p>
+            <w:r>
+              <w:rPr>
+                <w:color w:val="8B1A1A"/>
+                <w:sz w:val="19"/>
+                <w:szCs w:val="19"/>
+              </w:rPr>
+              <w:t>No unified customer ID across systems — structural. Requires ADR-002.</w:t>
+            </w:r>
+          </w:p>
+        </w:tc>
+      </w:tr>
+      <w:tr>
+        <w:tc>
+          <w:tcPr>
+            <w:tcW w:w="1600" w:type="dxa"/>
+            <w:tcBorders>
+              <w:top w:val="single" w:sz="1" w:space="0" w:color="D0D8EC"/>
+              <w:left w:val="single" w:sz="1" w:space="0" w:color="D0D8EC"/>
+              <w:bottom w:val="single" w:sz="1" w:space="0" w:color="D0D8EC"/>
+              <w:right w:val="single" w:sz="1" w:space="0" w:color="D0D8EC"/>
+            </w:tcBorders>
+            <w:shd w:val="clear" w:color="auto" w:fill="EEF1F8"/>
+            <w:tcMar>
+              <w:top w:w="90" w:type="dxa"/>
+              <w:left w:w="140" w:type="dxa"/>
+              <w:bottom w:w="90" w:type="dxa"/>
+              <w:right w:w="140" w:type="dxa"/>
+            </w:tcMar>
+          </w:tcPr>
+          <w:p>
+            <w:r>
+              <w:rPr>
+                <w:b/>
+                <w:bCs/>
+                <w:color w:val="1A2E5A"/>
+                <w:sz w:val="19"/>
+                <w:szCs w:val="19"/>
+              </w:rPr>
+              <w:lastRenderedPageBreak/>
               <w:t>Marketing</w:t>
             </w:r>
           </w:p>
@@ -5188,7 +5399,25 @@
           <w:iCs/>
           <w:color w:val="555555"/>
         </w:rPr>
-        <w:t>The data platform can make structural problems visible and measurable. It cannot fix them. Business leadership must formally acknowledge structural problems before platform go-live to prevent Gold layer outputs being treated as precise when they are approximate.</w:t>
+        <w:t xml:space="preserve">The data platform can make structural problems visible and measurable. It cannot fix them. Business leadership must formally acknowledge structural problems before platform go-live to prevent </w:t>
+      </w:r>
+      <w:proofErr w:type="gramStart"/>
+      <w:r>
+        <w:rPr>
+          <w:i/>
+          <w:iCs/>
+          <w:color w:val="555555"/>
+        </w:rPr>
+        <w:t>Gold</w:t>
+      </w:r>
+      <w:proofErr w:type="gramEnd"/>
+      <w:r>
+        <w:rPr>
+          <w:i/>
+          <w:iCs/>
+          <w:color w:val="555555"/>
+        </w:rPr>
+        <w:t xml:space="preserve"> layer outputs being treated as precise when they are approximate.</w:t>
       </w:r>
     </w:p>
     <w:p>
@@ -5200,6 +5429,7 @@
       <w:pPr>
         <w:spacing w:before="300" w:after="120"/>
       </w:pPr>
+      <w:proofErr w:type="gramStart"/>
       <w:r>
         <w:rPr>
           <w:b/>
@@ -5208,7 +5438,18 @@
           <w:sz w:val="26"/>
           <w:szCs w:val="26"/>
         </w:rPr>
-        <w:t>4.2  ADRs Triggered by Step 2 Interviews</w:t>
+        <w:t>4.2  ADRs</w:t>
+      </w:r>
+      <w:proofErr w:type="gramEnd"/>
+      <w:r>
+        <w:rPr>
+          <w:b/>
+          <w:bCs/>
+          <w:color w:val="1A2E5A"/>
+          <w:sz w:val="26"/>
+          <w:szCs w:val="26"/>
+        </w:rPr>
+        <w:t xml:space="preserve"> Triggered by Step 2 Interviews</w:t>
       </w:r>
     </w:p>
     <w:p>
@@ -5829,7 +6070,29 @@
                 <w:sz w:val="19"/>
                 <w:szCs w:val="19"/>
               </w:rPr>
-              <w:t>CRITICAL — must be agreed before any Gold layer marketing build</w:t>
+              <w:t xml:space="preserve">CRITICAL — must be agreed before any </w:t>
+            </w:r>
+            <w:proofErr w:type="gramStart"/>
+            <w:r>
+              <w:rPr>
+                <w:b/>
+                <w:bCs/>
+                <w:color w:val="8B1A1A"/>
+                <w:sz w:val="19"/>
+                <w:szCs w:val="19"/>
+              </w:rPr>
+              <w:t>Gold</w:t>
+            </w:r>
+            <w:proofErr w:type="gramEnd"/>
+            <w:r>
+              <w:rPr>
+                <w:b/>
+                <w:bCs/>
+                <w:color w:val="8B1A1A"/>
+                <w:sz w:val="19"/>
+                <w:szCs w:val="19"/>
+              </w:rPr>
+              <w:t xml:space="preserve"> layer marketing build</w:t>
             </w:r>
           </w:p>
         </w:tc>
@@ -6000,7 +6263,43 @@
                 <w:sz w:val="19"/>
                 <w:szCs w:val="19"/>
               </w:rPr>
-              <w:t>Attribution data does not exist in any RetailSphere source system. The data platform will create it for the first time. RetailSphere will spend R8.3M annually based on numbers that have no external validation source. ADR-006 must be formally agreed and signed by the CCO before any Gold layer marketing build begins.</w:t>
+              <w:t xml:space="preserve">Attribution data does not exist in any </w:t>
+            </w:r>
+            <w:proofErr w:type="spellStart"/>
+            <w:r>
+              <w:rPr>
+                <w:color w:val="1A1A1A"/>
+                <w:sz w:val="19"/>
+                <w:szCs w:val="19"/>
+              </w:rPr>
+              <w:t>RetailSphere</w:t>
+            </w:r>
+            <w:proofErr w:type="spellEnd"/>
+            <w:r>
+              <w:rPr>
+                <w:color w:val="1A1A1A"/>
+                <w:sz w:val="19"/>
+                <w:szCs w:val="19"/>
+              </w:rPr>
+              <w:t xml:space="preserve"> source system. The data platform will create it for the first time. </w:t>
+            </w:r>
+            <w:proofErr w:type="spellStart"/>
+            <w:r>
+              <w:rPr>
+                <w:color w:val="1A1A1A"/>
+                <w:sz w:val="19"/>
+                <w:szCs w:val="19"/>
+              </w:rPr>
+              <w:t>RetailSphere</w:t>
+            </w:r>
+            <w:proofErr w:type="spellEnd"/>
+            <w:r>
+              <w:rPr>
+                <w:color w:val="1A1A1A"/>
+                <w:sz w:val="19"/>
+                <w:szCs w:val="19"/>
+              </w:rPr>
+              <w:t xml:space="preserve"> will spend R8.3M annually based on numbers that have no external validation source. ADR-006 must be formally agreed and signed by the CCO before any Gold layer marketing build begins.</w:t>
             </w:r>
           </w:p>
         </w:tc>
@@ -6061,7 +6360,6 @@
                 <w:sz w:val="19"/>
                 <w:szCs w:val="19"/>
               </w:rPr>
-              <w:lastRenderedPageBreak/>
               <w:t>BPA-FINDING-003 — Domain Ownership Gap: Marketing vs Customer Loyalty</w:t>
             </w:r>
           </w:p>
@@ -6167,7 +6465,21 @@
         <w:rPr>
           <w:color w:val="1A1A1A"/>
         </w:rPr>
-        <w:t>6.  Initiate ADR-006 formal write-up — do not build Gold layer marketing until complete.</w:t>
+        <w:t xml:space="preserve">6.  Initiate ADR-006 formal write-up — do not build </w:t>
+      </w:r>
+      <w:proofErr w:type="gramStart"/>
+      <w:r>
+        <w:rPr>
+          <w:color w:val="1A1A1A"/>
+        </w:rPr>
+        <w:t>Gold</w:t>
+      </w:r>
+      <w:proofErr w:type="gramEnd"/>
+      <w:r>
+        <w:rPr>
+          <w:color w:val="1A1A1A"/>
+        </w:rPr>
+        <w:t xml:space="preserve"> layer marketing until complete.</w:t>
       </w:r>
     </w:p>
     <w:p>
@@ -6200,7 +6512,29 @@
           <w:sz w:val="16"/>
           <w:szCs w:val="16"/>
         </w:rPr>
-        <w:t>BPA-001 Draft v0.3 | RetailSphere Data Platform Programme | Confidential</w:t>
+        <w:t xml:space="preserve">BPA-001 Draft v0.3 | </w:t>
+      </w:r>
+      <w:proofErr w:type="spellStart"/>
+      <w:r>
+        <w:rPr>
+          <w:i/>
+          <w:iCs/>
+          <w:color w:val="555555"/>
+          <w:sz w:val="16"/>
+          <w:szCs w:val="16"/>
+        </w:rPr>
+        <w:t>RetailSphere</w:t>
+      </w:r>
+      <w:proofErr w:type="spellEnd"/>
+      <w:r>
+        <w:rPr>
+          <w:i/>
+          <w:iCs/>
+          <w:color w:val="555555"/>
+          <w:sz w:val="16"/>
+          <w:szCs w:val="16"/>
+        </w:rPr>
+        <w:t xml:space="preserve"> Data Platform Programme | Confidential</w:t>
       </w:r>
     </w:p>
     <w:sectPr>
@@ -6446,6 +6780,7 @@
           </w:tcBorders>
         </w:tcPr>
         <w:p>
+          <w:proofErr w:type="spellStart"/>
           <w:r>
             <w:rPr>
               <w:b/>
@@ -6454,7 +6789,18 @@
               <w:sz w:val="18"/>
               <w:szCs w:val="18"/>
             </w:rPr>
-            <w:t>RetailSphere (Pty) Ltd — Data Platform Programme</w:t>
+            <w:t>RetailSphere</w:t>
+          </w:r>
+          <w:proofErr w:type="spellEnd"/>
+          <w:r>
+            <w:rPr>
+              <w:b/>
+              <w:bCs/>
+              <w:color w:val="1A2E5A"/>
+              <w:sz w:val="18"/>
+              <w:szCs w:val="18"/>
+            </w:rPr>
+            <w:t xml:space="preserve"> (Pty) Ltd — Data Platform Programme</w:t>
           </w:r>
         </w:p>
       </w:tc>
@@ -6472,13 +6818,23 @@
           <w:pPr>
             <w:jc w:val="right"/>
           </w:pPr>
+          <w:proofErr w:type="gramStart"/>
           <w:r>
             <w:rPr>
               <w:color w:val="555555"/>
               <w:sz w:val="16"/>
               <w:szCs w:val="16"/>
             </w:rPr>
-            <w:t>CONFIDENTIAL  |  DRAFT v0.3</w:t>
+            <w:t>CONFIDENTIAL  |</w:t>
+          </w:r>
+          <w:proofErr w:type="gramEnd"/>
+          <w:r>
+            <w:rPr>
+              <w:color w:val="555555"/>
+              <w:sz w:val="16"/>
+              <w:szCs w:val="16"/>
+            </w:rPr>
+            <w:t xml:space="preserve">  DRAFT v0.3</w:t>
           </w:r>
         </w:p>
       </w:tc>
@@ -7064,6 +7420,7 @@
   <w:style w:type="character" w:default="1" w:styleId="DefaultParagraphFont">
     <w:name w:val="Default Paragraph Font"/>
     <w:uiPriority w:val="1"/>
+    <w:semiHidden/>
     <w:unhideWhenUsed/>
   </w:style>
   <w:style w:type="table" w:default="1" w:styleId="TableNormal">

</xml_diff>